<commit_message>
fix: replace ZXing dependency to avoid PresentationCore load
</commit_message>
<xml_diff>
--- a/examples/12-barcodes/output.docx
+++ b/examples/12-barcodes/output.docx
@@ -25,7 +25,7 @@
                     <pic:cNvPicPr/>
                   </pic:nvPicPr>
                   <pic:blipFill>
-                    <a:blip xmlns:r="http://schemas.openxmlformats.org/officeDocument/2006/relationships" r:embed="Rcefe09636f664af1" cstate="print"/>
+                    <a:blip xmlns:r="http://schemas.openxmlformats.org/officeDocument/2006/relationships" r:embed="Rd8a4e0efdc174c6b" cstate="print"/>
                     <a:stretch>
                       <a:fillRect/>
                     </a:stretch>
@@ -72,7 +72,7 @@
                     <pic:cNvPicPr/>
                   </pic:nvPicPr>
                   <pic:blipFill>
-                    <a:blip xmlns:r="http://schemas.openxmlformats.org/officeDocument/2006/relationships" r:embed="Rbd9b1c492d254aa1" cstate="print"/>
+                    <a:blip xmlns:r="http://schemas.openxmlformats.org/officeDocument/2006/relationships" r:embed="R56eb4681626c4bda" cstate="print"/>
                     <a:stretch>
                       <a:fillRect/>
                     </a:stretch>

</xml_diff>